<commit_message>
doc: update README.md and PROJECT_REPORT.docx
</commit_message>
<xml_diff>
--- a/PROJECT_REPORT.docx
+++ b/PROJECT_REPORT.docx
@@ -3610,6 +3610,315 @@
       <w:pPr>
         <w:pStyle w:val="Heading2"/>
         <w:jc w:val="both"/>
+        <w:rPr>
+          <w:lang w:val="en-IN"/>
+        </w:rPr>
+      </w:pPr>
+      <w:r>
+        <w:rPr>
+          <w:lang w:val="en-IN"/>
+        </w:rPr>
+        <w:t>Live Production Instance</w:t>
+      </w:r>
+    </w:p>
+    <w:p>
+      <w:pPr>
+        <w:pStyle w:val="ListParagraph"/>
+        <w:numPr>
+          <w:ilvl w:val="0"/>
+          <w:numId w:val="16"/>
+        </w:numPr>
+        <w:jc w:val="both"/>
+      </w:pPr>
+      <w:r>
+        <w:rPr>
+          <w:b/>
+          <w:bCs/>
+          <w:lang w:val="en-IN"/>
+        </w:rPr>
+        <w:t>Production URL</w:t>
+      </w:r>
+      <w:r>
+        <w:rPr>
+          <w:lang w:val="en-IN"/>
+        </w:rPr>
+        <w:t>: </w:t>
+      </w:r>
+      <w:hyperlink r:id="rId6" w:history="1">
+        <w:r>
+          <w:rPr>
+            <w:rStyle w:val="SubtitleChar"/>
+            <w:sz w:val="22"/>
+            <w:szCs w:val="22"/>
+            <w:lang w:val="en-IN"/>
+          </w:rPr>
+          <w:t>https://worker-risk-ml.streamlit.app</w:t>
+        </w:r>
+      </w:hyperlink>
+    </w:p>
+    <w:p>
+      <w:pPr>
+        <w:jc w:val="both"/>
+        <w:rPr>
+          <w:sz w:val="14"/>
+          <w:szCs w:val="14"/>
+          <w:lang w:val="en-IN"/>
+        </w:rPr>
+      </w:pPr>
+    </w:p>
+    <w:p>
+      <w:pPr>
+        <w:pStyle w:val="Heading2"/>
+        <w:jc w:val="both"/>
+        <w:rPr>
+          <w:lang w:val="en-IN"/>
+        </w:rPr>
+      </w:pPr>
+      <w:r>
+        <w:rPr>
+          <w:lang w:val="en-IN"/>
+        </w:rPr>
+        <w:t>Deployment Specifications:</w:t>
+      </w:r>
+    </w:p>
+    <w:p>
+      <w:pPr>
+        <w:numPr>
+          <w:ilvl w:val="0"/>
+          <w:numId w:val="14"/>
+        </w:numPr>
+        <w:jc w:val="both"/>
+        <w:rPr>
+          <w:lang w:val="en-IN"/>
+        </w:rPr>
+      </w:pPr>
+      <w:r>
+        <w:rPr>
+          <w:lang w:val="en-IN"/>
+        </w:rPr>
+        <w:t>Platform: Streamlit Cloud (Python 3.14.3)</w:t>
+      </w:r>
+    </w:p>
+    <w:p>
+      <w:pPr>
+        <w:numPr>
+          <w:ilvl w:val="0"/>
+          <w:numId w:val="14"/>
+        </w:numPr>
+        <w:jc w:val="both"/>
+        <w:rPr>
+          <w:lang w:val="en-IN"/>
+        </w:rPr>
+      </w:pPr>
+      <w:r>
+        <w:rPr>
+          <w:lang w:val="en-IN"/>
+        </w:rPr>
+        <w:t>Status: Active and production-ready</w:t>
+      </w:r>
+    </w:p>
+    <w:p>
+      <w:pPr>
+        <w:numPr>
+          <w:ilvl w:val="0"/>
+          <w:numId w:val="14"/>
+        </w:numPr>
+        <w:jc w:val="both"/>
+        <w:rPr>
+          <w:lang w:val="en-IN"/>
+        </w:rPr>
+      </w:pPr>
+      <w:r>
+        <w:rPr>
+          <w:lang w:val="en-IN"/>
+        </w:rPr>
+        <w:t>Data Coverage: 100% (500 workers analyzed)</w:t>
+      </w:r>
+    </w:p>
+    <w:p>
+      <w:pPr>
+        <w:numPr>
+          <w:ilvl w:val="0"/>
+          <w:numId w:val="14"/>
+        </w:numPr>
+        <w:jc w:val="both"/>
+        <w:rPr>
+          <w:lang w:val="en-IN"/>
+        </w:rPr>
+      </w:pPr>
+      <w:r>
+        <w:rPr>
+          <w:lang w:val="en-IN"/>
+        </w:rPr>
+        <w:t>Model Status: Gradient Boosting (88% accuracy) + K-Means clustering loaded and operational</w:t>
+      </w:r>
+    </w:p>
+    <w:p>
+      <w:pPr>
+        <w:numPr>
+          <w:ilvl w:val="0"/>
+          <w:numId w:val="14"/>
+        </w:numPr>
+        <w:jc w:val="both"/>
+        <w:rPr>
+          <w:lang w:val="en-IN"/>
+        </w:rPr>
+      </w:pPr>
+      <w:r>
+        <w:rPr>
+          <w:lang w:val="en-IN"/>
+        </w:rPr>
+        <w:t>Response Time: &lt;0.5s per prediction</w:t>
+      </w:r>
+    </w:p>
+    <w:p>
+      <w:pPr>
+        <w:numPr>
+          <w:ilvl w:val="0"/>
+          <w:numId w:val="14"/>
+        </w:numPr>
+        <w:jc w:val="both"/>
+        <w:rPr>
+          <w:lang w:val="en-IN"/>
+        </w:rPr>
+      </w:pPr>
+      <w:r>
+        <w:rPr>
+          <w:lang w:val="en-IN"/>
+        </w:rPr>
+        <w:t>Uptime: Continuous auto-deployment on main branch updates</w:t>
+      </w:r>
+    </w:p>
+    <w:p>
+      <w:pPr>
+        <w:pStyle w:val="Heading2"/>
+        <w:jc w:val="both"/>
+        <w:rPr>
+          <w:lang w:val="en-IN"/>
+        </w:rPr>
+      </w:pPr>
+      <w:r>
+        <w:rPr>
+          <w:lang w:val="en-IN"/>
+        </w:rPr>
+        <w:t>Accessible Features:</w:t>
+      </w:r>
+    </w:p>
+    <w:p>
+      <w:pPr>
+        <w:numPr>
+          <w:ilvl w:val="0"/>
+          <w:numId w:val="15"/>
+        </w:numPr>
+        <w:jc w:val="both"/>
+        <w:rPr>
+          <w:lang w:val="en-IN"/>
+        </w:rPr>
+      </w:pPr>
+      <w:r>
+        <w:rPr>
+          <w:lang w:val="en-IN"/>
+        </w:rPr>
+        <w:t>Real-time dashboard with system overview and KPIs</w:t>
+      </w:r>
+    </w:p>
+    <w:p>
+      <w:pPr>
+        <w:numPr>
+          <w:ilvl w:val="0"/>
+          <w:numId w:val="15"/>
+        </w:numPr>
+        <w:jc w:val="both"/>
+        <w:rPr>
+          <w:lang w:val="en-IN"/>
+        </w:rPr>
+      </w:pPr>
+      <w:r>
+        <w:rPr>
+          <w:lang w:val="en-IN"/>
+        </w:rPr>
+        <w:t>Worker profile search with detailed risk assessment</w:t>
+      </w:r>
+    </w:p>
+    <w:p>
+      <w:pPr>
+        <w:numPr>
+          <w:ilvl w:val="0"/>
+          <w:numId w:val="15"/>
+        </w:numPr>
+        <w:jc w:val="both"/>
+        <w:rPr>
+          <w:lang w:val="en-IN"/>
+        </w:rPr>
+      </w:pPr>
+      <w:r>
+        <w:rPr>
+          <w:lang w:val="en-IN"/>
+        </w:rPr>
+        <w:t>Cluster analysis comparing workforce segments</w:t>
+      </w:r>
+    </w:p>
+    <w:p>
+      <w:pPr>
+        <w:numPr>
+          <w:ilvl w:val="0"/>
+          <w:numId w:val="15"/>
+        </w:numPr>
+        <w:jc w:val="both"/>
+        <w:rPr>
+          <w:lang w:val="en-IN"/>
+        </w:rPr>
+      </w:pPr>
+      <w:r>
+        <w:rPr>
+          <w:lang w:val="en-IN"/>
+        </w:rPr>
+        <w:t>Advanced filtering and search capabilities</w:t>
+      </w:r>
+    </w:p>
+    <w:p>
+      <w:pPr>
+        <w:numPr>
+          <w:ilvl w:val="0"/>
+          <w:numId w:val="15"/>
+        </w:numPr>
+        <w:jc w:val="both"/>
+        <w:rPr>
+          <w:lang w:val="en-IN"/>
+        </w:rPr>
+      </w:pPr>
+      <w:r>
+        <w:rPr>
+          <w:lang w:val="en-IN"/>
+        </w:rPr>
+        <w:t>Recommendation engine with prioritized interventions</w:t>
+      </w:r>
+    </w:p>
+    <w:p>
+      <w:pPr>
+        <w:numPr>
+          <w:ilvl w:val="0"/>
+          <w:numId w:val="15"/>
+        </w:numPr>
+        <w:jc w:val="both"/>
+      </w:pPr>
+      <w:r>
+        <w:rPr>
+          <w:lang w:val="en-IN"/>
+        </w:rPr>
+        <w:t>Report export functionality</w:t>
+      </w:r>
+    </w:p>
+    <w:p>
+      <w:pPr>
+        <w:pStyle w:val="Heading2"/>
+        <w:jc w:val="both"/>
+      </w:pPr>
+    </w:p>
+    <w:p>
+      <w:pPr>
+        <w:pStyle w:val="Heading2"/>
+        <w:jc w:val="both"/>
       </w:pPr>
       <w:r>
         <w:t>System Architecture</w:t>
@@ -3621,21 +3930,6 @@
       </w:pPr>
       <w:r>
         <w:t>5-Tier Design: User Interfaces (Dashboard/CLI/API) → Integration Layer → ML &amp; Business Logic (GB Model, Clustering, Recommendations) → Data Layer</w:t>
-      </w:r>
-    </w:p>
-    <w:p>
-      <w:pPr>
-        <w:jc w:val="both"/>
-      </w:pPr>
-      <w:r>
-        <w:rPr>
-          <w:b/>
-          <w:bCs/>
-        </w:rPr>
-        <w:t>Performance:</w:t>
-      </w:r>
-      <w:r>
-        <w:t xml:space="preserve"> &lt; 0.5s response time per prediction; 100% workforce coverage; 15 critical workers identified</w:t>
       </w:r>
     </w:p>
     <w:p>
@@ -3869,6 +4163,7 @@
         <w:jc w:val="both"/>
       </w:pPr>
       <w:r>
+        <w:lastRenderedPageBreak/>
         <w:t>7. Conclusion</w:t>
       </w:r>
     </w:p>
@@ -3968,6 +4263,12 @@
       <w:r>
         <w:t>Fully explainable predictions (SHAP + feature importance per worker)</w:t>
       </w:r>
+    </w:p>
+    <w:p>
+      <w:pPr>
+        <w:pStyle w:val="Heading2"/>
+        <w:jc w:val="both"/>
+      </w:pPr>
     </w:p>
     <w:p>
       <w:pPr>
@@ -4179,7 +4480,7 @@
   <w:abstractNum w:abstractNumId="7" w15:restartNumberingAfterBreak="0">
     <w:nsid w:val="FFFFFF88"/>
     <w:multiLevelType w:val="singleLevel"/>
-    <w:tmpl w:val="560EE150"/>
+    <w:tmpl w:val="CD2A7762"/>
     <w:lvl w:ilvl="0">
       <w:start w:val="1"/>
       <w:numFmt w:val="decimal"/>
@@ -4197,7 +4498,7 @@
   <w:abstractNum w:abstractNumId="8" w15:restartNumberingAfterBreak="0">
     <w:nsid w:val="FFFFFF89"/>
     <w:multiLevelType w:val="singleLevel"/>
-    <w:tmpl w:val="29761A62"/>
+    <w:tmpl w:val="FC364144"/>
     <w:lvl w:ilvl="0">
       <w:start w:val="1"/>
       <w:numFmt w:val="bullet"/>
@@ -4325,6 +4626,417 @@
       </w:pPr>
       <w:rPr>
         <w:rFonts w:ascii="Wingdings" w:hAnsi="Wingdings" w:hint="default"/>
+      </w:rPr>
+    </w:lvl>
+  </w:abstractNum>
+  <w:abstractNum w:abstractNumId="10" w15:restartNumberingAfterBreak="0">
+    <w:nsid w:val="21F03561"/>
+    <w:multiLevelType w:val="hybridMultilevel"/>
+    <w:tmpl w:val="0B2866CA"/>
+    <w:lvl w:ilvl="0" w:tplc="40090003">
+      <w:start w:val="1"/>
+      <w:numFmt w:val="bullet"/>
+      <w:lvlText w:val="o"/>
+      <w:lvlJc w:val="left"/>
+      <w:pPr>
+        <w:ind w:left="720" w:hanging="360"/>
+      </w:pPr>
+      <w:rPr>
+        <w:rFonts w:ascii="Courier New" w:hAnsi="Courier New" w:cs="Courier New" w:hint="default"/>
+      </w:rPr>
+    </w:lvl>
+    <w:lvl w:ilvl="1" w:tplc="40090003" w:tentative="1">
+      <w:start w:val="1"/>
+      <w:numFmt w:val="bullet"/>
+      <w:lvlText w:val="o"/>
+      <w:lvlJc w:val="left"/>
+      <w:pPr>
+        <w:ind w:left="1440" w:hanging="360"/>
+      </w:pPr>
+      <w:rPr>
+        <w:rFonts w:ascii="Courier New" w:hAnsi="Courier New" w:cs="Courier New" w:hint="default"/>
+      </w:rPr>
+    </w:lvl>
+    <w:lvl w:ilvl="2" w:tplc="40090005" w:tentative="1">
+      <w:start w:val="1"/>
+      <w:numFmt w:val="bullet"/>
+      <w:lvlText w:val=""/>
+      <w:lvlJc w:val="left"/>
+      <w:pPr>
+        <w:ind w:left="2160" w:hanging="360"/>
+      </w:pPr>
+      <w:rPr>
+        <w:rFonts w:ascii="Wingdings" w:hAnsi="Wingdings" w:hint="default"/>
+      </w:rPr>
+    </w:lvl>
+    <w:lvl w:ilvl="3" w:tplc="40090001" w:tentative="1">
+      <w:start w:val="1"/>
+      <w:numFmt w:val="bullet"/>
+      <w:lvlText w:val=""/>
+      <w:lvlJc w:val="left"/>
+      <w:pPr>
+        <w:ind w:left="2880" w:hanging="360"/>
+      </w:pPr>
+      <w:rPr>
+        <w:rFonts w:ascii="Symbol" w:hAnsi="Symbol" w:hint="default"/>
+      </w:rPr>
+    </w:lvl>
+    <w:lvl w:ilvl="4" w:tplc="40090003" w:tentative="1">
+      <w:start w:val="1"/>
+      <w:numFmt w:val="bullet"/>
+      <w:lvlText w:val="o"/>
+      <w:lvlJc w:val="left"/>
+      <w:pPr>
+        <w:ind w:left="3600" w:hanging="360"/>
+      </w:pPr>
+      <w:rPr>
+        <w:rFonts w:ascii="Courier New" w:hAnsi="Courier New" w:cs="Courier New" w:hint="default"/>
+      </w:rPr>
+    </w:lvl>
+    <w:lvl w:ilvl="5" w:tplc="40090005" w:tentative="1">
+      <w:start w:val="1"/>
+      <w:numFmt w:val="bullet"/>
+      <w:lvlText w:val=""/>
+      <w:lvlJc w:val="left"/>
+      <w:pPr>
+        <w:ind w:left="4320" w:hanging="360"/>
+      </w:pPr>
+      <w:rPr>
+        <w:rFonts w:ascii="Wingdings" w:hAnsi="Wingdings" w:hint="default"/>
+      </w:rPr>
+    </w:lvl>
+    <w:lvl w:ilvl="6" w:tplc="40090001" w:tentative="1">
+      <w:start w:val="1"/>
+      <w:numFmt w:val="bullet"/>
+      <w:lvlText w:val=""/>
+      <w:lvlJc w:val="left"/>
+      <w:pPr>
+        <w:ind w:left="5040" w:hanging="360"/>
+      </w:pPr>
+      <w:rPr>
+        <w:rFonts w:ascii="Symbol" w:hAnsi="Symbol" w:hint="default"/>
+      </w:rPr>
+    </w:lvl>
+    <w:lvl w:ilvl="7" w:tplc="40090003" w:tentative="1">
+      <w:start w:val="1"/>
+      <w:numFmt w:val="bullet"/>
+      <w:lvlText w:val="o"/>
+      <w:lvlJc w:val="left"/>
+      <w:pPr>
+        <w:ind w:left="5760" w:hanging="360"/>
+      </w:pPr>
+      <w:rPr>
+        <w:rFonts w:ascii="Courier New" w:hAnsi="Courier New" w:cs="Courier New" w:hint="default"/>
+      </w:rPr>
+    </w:lvl>
+    <w:lvl w:ilvl="8" w:tplc="40090005" w:tentative="1">
+      <w:start w:val="1"/>
+      <w:numFmt w:val="bullet"/>
+      <w:lvlText w:val=""/>
+      <w:lvlJc w:val="left"/>
+      <w:pPr>
+        <w:ind w:left="6480" w:hanging="360"/>
+      </w:pPr>
+      <w:rPr>
+        <w:rFonts w:ascii="Wingdings" w:hAnsi="Wingdings" w:hint="default"/>
+      </w:rPr>
+    </w:lvl>
+  </w:abstractNum>
+  <w:abstractNum w:abstractNumId="11" w15:restartNumberingAfterBreak="0">
+    <w:nsid w:val="3B7247D5"/>
+    <w:multiLevelType w:val="multilevel"/>
+    <w:tmpl w:val="E5F8D794"/>
+    <w:lvl w:ilvl="0">
+      <w:start w:val="1"/>
+      <w:numFmt w:val="bullet"/>
+      <w:lvlText w:val=""/>
+      <w:lvlJc w:val="left"/>
+      <w:pPr>
+        <w:tabs>
+          <w:tab w:val="num" w:pos="720"/>
+        </w:tabs>
+        <w:ind w:left="720" w:hanging="360"/>
+      </w:pPr>
+      <w:rPr>
+        <w:rFonts w:ascii="Symbol" w:hAnsi="Symbol" w:hint="default"/>
+        <w:sz w:val="20"/>
+      </w:rPr>
+    </w:lvl>
+    <w:lvl w:ilvl="1" w:tentative="1">
+      <w:start w:val="1"/>
+      <w:numFmt w:val="bullet"/>
+      <w:lvlText w:val="o"/>
+      <w:lvlJc w:val="left"/>
+      <w:pPr>
+        <w:tabs>
+          <w:tab w:val="num" w:pos="1440"/>
+        </w:tabs>
+        <w:ind w:left="1440" w:hanging="360"/>
+      </w:pPr>
+      <w:rPr>
+        <w:rFonts w:ascii="Courier New" w:hAnsi="Courier New" w:hint="default"/>
+        <w:sz w:val="20"/>
+      </w:rPr>
+    </w:lvl>
+    <w:lvl w:ilvl="2" w:tentative="1">
+      <w:start w:val="1"/>
+      <w:numFmt w:val="bullet"/>
+      <w:lvlText w:val=""/>
+      <w:lvlJc w:val="left"/>
+      <w:pPr>
+        <w:tabs>
+          <w:tab w:val="num" w:pos="2160"/>
+        </w:tabs>
+        <w:ind w:left="2160" w:hanging="360"/>
+      </w:pPr>
+      <w:rPr>
+        <w:rFonts w:ascii="Wingdings" w:hAnsi="Wingdings" w:hint="default"/>
+        <w:sz w:val="20"/>
+      </w:rPr>
+    </w:lvl>
+    <w:lvl w:ilvl="3" w:tentative="1">
+      <w:start w:val="1"/>
+      <w:numFmt w:val="bullet"/>
+      <w:lvlText w:val=""/>
+      <w:lvlJc w:val="left"/>
+      <w:pPr>
+        <w:tabs>
+          <w:tab w:val="num" w:pos="2880"/>
+        </w:tabs>
+        <w:ind w:left="2880" w:hanging="360"/>
+      </w:pPr>
+      <w:rPr>
+        <w:rFonts w:ascii="Wingdings" w:hAnsi="Wingdings" w:hint="default"/>
+        <w:sz w:val="20"/>
+      </w:rPr>
+    </w:lvl>
+    <w:lvl w:ilvl="4" w:tentative="1">
+      <w:start w:val="1"/>
+      <w:numFmt w:val="bullet"/>
+      <w:lvlText w:val=""/>
+      <w:lvlJc w:val="left"/>
+      <w:pPr>
+        <w:tabs>
+          <w:tab w:val="num" w:pos="3600"/>
+        </w:tabs>
+        <w:ind w:left="3600" w:hanging="360"/>
+      </w:pPr>
+      <w:rPr>
+        <w:rFonts w:ascii="Wingdings" w:hAnsi="Wingdings" w:hint="default"/>
+        <w:sz w:val="20"/>
+      </w:rPr>
+    </w:lvl>
+    <w:lvl w:ilvl="5" w:tentative="1">
+      <w:start w:val="1"/>
+      <w:numFmt w:val="bullet"/>
+      <w:lvlText w:val=""/>
+      <w:lvlJc w:val="left"/>
+      <w:pPr>
+        <w:tabs>
+          <w:tab w:val="num" w:pos="4320"/>
+        </w:tabs>
+        <w:ind w:left="4320" w:hanging="360"/>
+      </w:pPr>
+      <w:rPr>
+        <w:rFonts w:ascii="Wingdings" w:hAnsi="Wingdings" w:hint="default"/>
+        <w:sz w:val="20"/>
+      </w:rPr>
+    </w:lvl>
+    <w:lvl w:ilvl="6" w:tentative="1">
+      <w:start w:val="1"/>
+      <w:numFmt w:val="bullet"/>
+      <w:lvlText w:val=""/>
+      <w:lvlJc w:val="left"/>
+      <w:pPr>
+        <w:tabs>
+          <w:tab w:val="num" w:pos="5040"/>
+        </w:tabs>
+        <w:ind w:left="5040" w:hanging="360"/>
+      </w:pPr>
+      <w:rPr>
+        <w:rFonts w:ascii="Wingdings" w:hAnsi="Wingdings" w:hint="default"/>
+        <w:sz w:val="20"/>
+      </w:rPr>
+    </w:lvl>
+    <w:lvl w:ilvl="7" w:tentative="1">
+      <w:start w:val="1"/>
+      <w:numFmt w:val="bullet"/>
+      <w:lvlText w:val=""/>
+      <w:lvlJc w:val="left"/>
+      <w:pPr>
+        <w:tabs>
+          <w:tab w:val="num" w:pos="5760"/>
+        </w:tabs>
+        <w:ind w:left="5760" w:hanging="360"/>
+      </w:pPr>
+      <w:rPr>
+        <w:rFonts w:ascii="Wingdings" w:hAnsi="Wingdings" w:hint="default"/>
+        <w:sz w:val="20"/>
+      </w:rPr>
+    </w:lvl>
+    <w:lvl w:ilvl="8" w:tentative="1">
+      <w:start w:val="1"/>
+      <w:numFmt w:val="bullet"/>
+      <w:lvlText w:val=""/>
+      <w:lvlJc w:val="left"/>
+      <w:pPr>
+        <w:tabs>
+          <w:tab w:val="num" w:pos="6480"/>
+        </w:tabs>
+        <w:ind w:left="6480" w:hanging="360"/>
+      </w:pPr>
+      <w:rPr>
+        <w:rFonts w:ascii="Wingdings" w:hAnsi="Wingdings" w:hint="default"/>
+        <w:sz w:val="20"/>
+      </w:rPr>
+    </w:lvl>
+  </w:abstractNum>
+  <w:abstractNum w:abstractNumId="12" w15:restartNumberingAfterBreak="0">
+    <w:nsid w:val="627E3F31"/>
+    <w:multiLevelType w:val="multilevel"/>
+    <w:tmpl w:val="E960A0EC"/>
+    <w:lvl w:ilvl="0">
+      <w:start w:val="1"/>
+      <w:numFmt w:val="bullet"/>
+      <w:lvlText w:val=""/>
+      <w:lvlJc w:val="left"/>
+      <w:pPr>
+        <w:tabs>
+          <w:tab w:val="num" w:pos="720"/>
+        </w:tabs>
+        <w:ind w:left="720" w:hanging="360"/>
+      </w:pPr>
+      <w:rPr>
+        <w:rFonts w:ascii="Symbol" w:hAnsi="Symbol" w:hint="default"/>
+        <w:sz w:val="20"/>
+      </w:rPr>
+    </w:lvl>
+    <w:lvl w:ilvl="1" w:tentative="1">
+      <w:start w:val="1"/>
+      <w:numFmt w:val="bullet"/>
+      <w:lvlText w:val="o"/>
+      <w:lvlJc w:val="left"/>
+      <w:pPr>
+        <w:tabs>
+          <w:tab w:val="num" w:pos="1440"/>
+        </w:tabs>
+        <w:ind w:left="1440" w:hanging="360"/>
+      </w:pPr>
+      <w:rPr>
+        <w:rFonts w:ascii="Courier New" w:hAnsi="Courier New" w:hint="default"/>
+        <w:sz w:val="20"/>
+      </w:rPr>
+    </w:lvl>
+    <w:lvl w:ilvl="2" w:tentative="1">
+      <w:start w:val="1"/>
+      <w:numFmt w:val="bullet"/>
+      <w:lvlText w:val=""/>
+      <w:lvlJc w:val="left"/>
+      <w:pPr>
+        <w:tabs>
+          <w:tab w:val="num" w:pos="2160"/>
+        </w:tabs>
+        <w:ind w:left="2160" w:hanging="360"/>
+      </w:pPr>
+      <w:rPr>
+        <w:rFonts w:ascii="Wingdings" w:hAnsi="Wingdings" w:hint="default"/>
+        <w:sz w:val="20"/>
+      </w:rPr>
+    </w:lvl>
+    <w:lvl w:ilvl="3" w:tentative="1">
+      <w:start w:val="1"/>
+      <w:numFmt w:val="bullet"/>
+      <w:lvlText w:val=""/>
+      <w:lvlJc w:val="left"/>
+      <w:pPr>
+        <w:tabs>
+          <w:tab w:val="num" w:pos="2880"/>
+        </w:tabs>
+        <w:ind w:left="2880" w:hanging="360"/>
+      </w:pPr>
+      <w:rPr>
+        <w:rFonts w:ascii="Wingdings" w:hAnsi="Wingdings" w:hint="default"/>
+        <w:sz w:val="20"/>
+      </w:rPr>
+    </w:lvl>
+    <w:lvl w:ilvl="4" w:tentative="1">
+      <w:start w:val="1"/>
+      <w:numFmt w:val="bullet"/>
+      <w:lvlText w:val=""/>
+      <w:lvlJc w:val="left"/>
+      <w:pPr>
+        <w:tabs>
+          <w:tab w:val="num" w:pos="3600"/>
+        </w:tabs>
+        <w:ind w:left="3600" w:hanging="360"/>
+      </w:pPr>
+      <w:rPr>
+        <w:rFonts w:ascii="Wingdings" w:hAnsi="Wingdings" w:hint="default"/>
+        <w:sz w:val="20"/>
+      </w:rPr>
+    </w:lvl>
+    <w:lvl w:ilvl="5" w:tentative="1">
+      <w:start w:val="1"/>
+      <w:numFmt w:val="bullet"/>
+      <w:lvlText w:val=""/>
+      <w:lvlJc w:val="left"/>
+      <w:pPr>
+        <w:tabs>
+          <w:tab w:val="num" w:pos="4320"/>
+        </w:tabs>
+        <w:ind w:left="4320" w:hanging="360"/>
+      </w:pPr>
+      <w:rPr>
+        <w:rFonts w:ascii="Wingdings" w:hAnsi="Wingdings" w:hint="default"/>
+        <w:sz w:val="20"/>
+      </w:rPr>
+    </w:lvl>
+    <w:lvl w:ilvl="6" w:tentative="1">
+      <w:start w:val="1"/>
+      <w:numFmt w:val="bullet"/>
+      <w:lvlText w:val=""/>
+      <w:lvlJc w:val="left"/>
+      <w:pPr>
+        <w:tabs>
+          <w:tab w:val="num" w:pos="5040"/>
+        </w:tabs>
+        <w:ind w:left="5040" w:hanging="360"/>
+      </w:pPr>
+      <w:rPr>
+        <w:rFonts w:ascii="Wingdings" w:hAnsi="Wingdings" w:hint="default"/>
+        <w:sz w:val="20"/>
+      </w:rPr>
+    </w:lvl>
+    <w:lvl w:ilvl="7" w:tentative="1">
+      <w:start w:val="1"/>
+      <w:numFmt w:val="bullet"/>
+      <w:lvlText w:val=""/>
+      <w:lvlJc w:val="left"/>
+      <w:pPr>
+        <w:tabs>
+          <w:tab w:val="num" w:pos="5760"/>
+        </w:tabs>
+        <w:ind w:left="5760" w:hanging="360"/>
+      </w:pPr>
+      <w:rPr>
+        <w:rFonts w:ascii="Wingdings" w:hAnsi="Wingdings" w:hint="default"/>
+        <w:sz w:val="20"/>
+      </w:rPr>
+    </w:lvl>
+    <w:lvl w:ilvl="8" w:tentative="1">
+      <w:start w:val="1"/>
+      <w:numFmt w:val="bullet"/>
+      <w:lvlText w:val=""/>
+      <w:lvlJc w:val="left"/>
+      <w:pPr>
+        <w:tabs>
+          <w:tab w:val="num" w:pos="6480"/>
+        </w:tabs>
+        <w:ind w:left="6480" w:hanging="360"/>
+      </w:pPr>
+      <w:rPr>
+        <w:rFonts w:ascii="Wingdings" w:hAnsi="Wingdings" w:hint="default"/>
+        <w:sz w:val="20"/>
       </w:rPr>
     </w:lvl>
   </w:abstractNum>
@@ -4363,6 +5075,18 @@
   </w:num>
   <w:num w:numId="12" w16cid:durableId="1331175666">
     <w:abstractNumId w:val="9"/>
+  </w:num>
+  <w:num w:numId="13" w16cid:durableId="1652097920">
+    <w:abstractNumId w:val="7"/>
+  </w:num>
+  <w:num w:numId="14" w16cid:durableId="329601158">
+    <w:abstractNumId w:val="12"/>
+  </w:num>
+  <w:num w:numId="15" w16cid:durableId="2096897654">
+    <w:abstractNumId w:val="11"/>
+  </w:num>
+  <w:num w:numId="16" w16cid:durableId="29693366">
+    <w:abstractNumId w:val="10"/>
   </w:num>
 </w:numbering>
 </file>
@@ -4973,7 +5697,6 @@
   <w:style w:type="character" w:default="1" w:styleId="DefaultParagraphFont">
     <w:name w:val="Default Paragraph Font"/>
     <w:uiPriority w:val="1"/>
-    <w:semiHidden/>
     <w:unhideWhenUsed/>
   </w:style>
   <w:style w:type="table" w:default="1" w:styleId="TableNormal">
@@ -16067,6 +16790,29 @@
       </w:tcPr>
     </w:tblStylePr>
   </w:style>
+  <w:style w:type="character" w:styleId="Hyperlink">
+    <w:name w:val="Hyperlink"/>
+    <w:basedOn w:val="DefaultParagraphFont"/>
+    <w:uiPriority w:val="99"/>
+    <w:unhideWhenUsed/>
+    <w:rsid w:val="006B3FE2"/>
+    <w:rPr>
+      <w:color w:val="0000FF" w:themeColor="hyperlink"/>
+      <w:u w:val="single"/>
+    </w:rPr>
+  </w:style>
+  <w:style w:type="character" w:styleId="UnresolvedMention">
+    <w:name w:val="Unresolved Mention"/>
+    <w:basedOn w:val="DefaultParagraphFont"/>
+    <w:uiPriority w:val="99"/>
+    <w:semiHidden/>
+    <w:unhideWhenUsed/>
+    <w:rsid w:val="006B3FE2"/>
+    <w:rPr>
+      <w:color w:val="605E5C"/>
+      <w:shd w:val="clear" w:color="auto" w:fill="E1DFDD"/>
+    </w:rPr>
+  </w:style>
 </w:styles>
 </file>
 

</xml_diff>